<commit_message>
Fix page-number field formatting in handout footers
The PAGE field was emitted as begin / instrText / end with no result
run, so the renderer supplied its own and the number came out in the
default font -- visibly larger than the footer text around it.

Emit the full begin / separate / result / end structure with the
footer's own formatting on every run.

Co-Authored-By: Claude Opus 5 <noreply@anthropic.com>
Claude-Session: https://claude.ai/code/session_01FPYtZB6P1JoD1JsvRRZGPF
</commit_message>
<xml_diff>
--- a/seminars/software-validation-cybersecurity/Facilitator_Guide.docx
+++ b/seminars/software-validation-cybersecurity/Facilitator_Guide.docx
@@ -4017,7 +4017,37 @@
         <w:sz w:val="16"/>
       </w:rPr>
       <w:fldChar w:fldCharType="begin"/>
+    </w:r>
+    <w:r>
+      <w:rPr>
+        <w:rFonts w:ascii="Calibri" w:hAnsi="Calibri"/>
+        <w:color w:val="4E626D"/>
+        <w:sz w:val="16"/>
+      </w:rPr>
       <w:instrText xml:space="preserve"> PAGE </w:instrText>
+    </w:r>
+    <w:r>
+      <w:rPr>
+        <w:rFonts w:ascii="Calibri" w:hAnsi="Calibri"/>
+        <w:color w:val="4E626D"/>
+        <w:sz w:val="16"/>
+      </w:rPr>
+      <w:fldChar w:fldCharType="separate"/>
+    </w:r>
+    <w:r>
+      <w:rPr>
+        <w:rFonts w:ascii="Calibri" w:hAnsi="Calibri"/>
+        <w:color w:val="4E626D"/>
+        <w:sz w:val="16"/>
+      </w:rPr>
+      <w:t>1</w:t>
+    </w:r>
+    <w:r>
+      <w:rPr>
+        <w:rFonts w:ascii="Calibri" w:hAnsi="Calibri"/>
+        <w:color w:val="4E626D"/>
+        <w:sz w:val="16"/>
+      </w:rPr>
       <w:fldChar w:fldCharType="end"/>
     </w:r>
   </w:p>

</xml_diff>